<commit_message>
Apply May 22 audit fixes, hub voice cleanup, and footer social UX.
Remove em dashes from kit captions and cluster hub metadata or copy; lock lean kit template for future publishes; enlarge footer social icons and show them below Book a Consultation on mobile only.

Co-authored-by: Cursor <cursoragent@cursor.com>
</commit_message>
<xml_diff>
--- a/social/kits/KIT-signs-parent-needs-home-care.docx
+++ b/social/kits/KIT-signs-parent-needs-home-care.docx
@@ -57,7 +57,7 @@
           <w:sz w:val="22"/>
           <w:szCs w:val="22"/>
         </w:rPr>
-        <w:t xml:space="preserve">This kit contains ready-to-paste captions for Facebook, LinkedIn, and Instagram, a 14-day distribution schedule, and voice rules. For strategy context — what this article is, the key reframe, and platform priorities — see BRIEF-signs-parent-needs-home-care.md.</w:t>
+        <w:t xml:space="preserve">This kit contains ready-to-paste captions for Facebook, LinkedIn, and Instagram, a 14-day distribution schedule, and voice rules. For strategy context (what this article is, the key reframe, and platform priorities), see BRIEF-signs-parent-needs-home-care.md.</w:t>
       </w:r>
     </w:p>
     <w:p>
@@ -260,7 +260,7 @@
           <w:sz w:val="22"/>
           <w:szCs w:val="22"/>
         </w:rPr>
-        <w:t xml:space="preserve">The reader has been quietly adjusting for months — calling more, filling the fridge, staying longer — without naming what is happening. The article gives them language for it.</w:t>
+        <w:t xml:space="preserve">The reader has been quietly adjusting for months: calling more, filling the fridge, staying longer, without naming what is happening. The article gives them language for it.</w:t>
       </w:r>
     </w:p>
     <w:p>
@@ -287,7 +287,7 @@
           <w:sz w:val="22"/>
           <w:szCs w:val="22"/>
         </w:rPr>
-        <w:t xml:space="preserve">You do not have to wait for a single dramatic moment. The pattern is the signal. Recognizing that your parent needs more support is not a verdict — it is an accurate read.</w:t>
+        <w:t xml:space="preserve">You do not have to wait for a single dramatic moment. The pattern is the signal. Recognizing that your parent needs more support is not a verdict. It is an accurate read.</w:t>
       </w:r>
     </w:p>
     <w:p>
@@ -516,7 +516,7 @@
           <w:szCs w:val="22"/>
         </w:rPr>
         <w:t xml:space="preserve">"The signs are usually there before the question forms."
-If you have been calling more, staying longer, quietly filling in gaps — you are probably further along in knowing than you realize.
+If you have been calling more, staying longer, quietly filling in gaps, you are probably further along in knowing than you realize.
 Link in bio.</w:t>
       </w:r>
     </w:p>
@@ -556,7 +556,7 @@
         <w:spacing w:after="80" w:before="200"/>
       </w:pPr>
       <w:r>
-        <w:t xml:space="preserve">Reframe 1: It is not one moment — it is a pattern</w:t>
+        <w:t xml:space="preserve">Reframe 1: It is not one moment. It is a pattern</w:t>
       </w:r>
     </w:p>
     <w:p/>
@@ -629,7 +629,7 @@
         </w:rPr>
         <w:t xml:space="preserve">The families we hear from most often did not come to us after a single event. They came after accumulation.
 The gradual shift from visiting to managing. The baseline that kept getting lower.
-Recognizing that shift early — before a crisis — is one of the highest-value things a family can do. This article is for the families still in that in-between period.
+Recognizing that shift early (before a crisis) is one of the highest-value things a family can do. This article is for the families still in that in-between period.
 https://www.arcadiahomecare.ca/resources/navigating-home-care/signs-parent-needs-home-care/</w:t>
       </w:r>
     </w:p>
@@ -665,7 +665,7 @@
           <w:szCs w:val="22"/>
         </w:rPr>
         <w:t xml:space="preserve">It is rarely one moment.
-It is months of quietly adjusting — until the adjustments are not enough anymore.
+It is months of quietly adjusting, until the adjustments are not enough anymore.
 If you are in that in-between period, this is for you. Link in bio.</w:t>
       </w:r>
     </w:p>
@@ -748,7 +748,7 @@
           <w:szCs w:val="22"/>
         </w:rPr>
         <w:t xml:space="preserve">A reframe worth sharing with families at the point of decision:
-Recognizing that a parent needs professional support is not a verdict on how care has been managed so far. It is usually the opposite — it means the family has been paying close attention.
+Recognizing that a parent needs professional support is not a verdict on how care has been managed so far. It is usually the opposite. It means the family has been paying close attention.
 For clinicians working with family caregivers, this framing tends to reduce resistance significantly.
 https://www.arcadiahomecare.ca/resources/navigating-home-care/signs-parent-needs-home-care/</w:t>
       </w:r>
@@ -830,7 +830,7 @@
           <w:sz w:val="22"/>
           <w:szCs w:val="22"/>
         </w:rPr>
-        <w:t xml:space="preserve">If you are lying awake worrying about what might happen overnight — whether a fall, a missed medication, a door left unlocked — that worry is usually accurate.
+        <w:t xml:space="preserve">If you are lying awake worrying about what might happen overnight (a fall, a missed medication, a door left unlocked), that worry is usually accurate.
 It does not mean the response has to be drastic. It means the timing matters.
 This piece is about how to read that signal.
 [Link in caption]</w:t>
@@ -967,7 +967,7 @@
           <w:sz w:val="22"/>
           <w:szCs w:val="22"/>
         </w:rPr>
-        <w:t xml:space="preserve">If you have a sibling who lives farther away and does not fully understand what you have been managing — this is the article to send them.
+        <w:t xml:space="preserve">If you have a sibling who lives farther away and does not fully understand what you have been managing, this is the article to send them.
 It does not argue. It just describes what the in-between period looks like from the inside.
 [Link in caption]</w:t>
       </w:r>
@@ -1070,7 +1070,7 @@
         </w:rPr>
         <w:t xml:space="preserve">The families we work with most often describe the same thing when we ask how long they knew before they called.
 "A few months. Maybe longer."
-The quiet adjustment period — filling in gaps, calling more, rearranging schedules — is almost always longer than families realize. By the time they reach out, they have already been caregiving.
+The quiet adjustment period (filling in gaps, calling more, rearranging schedules) is almost always longer than families realize. By the time they reach out, they have already been caregiving.
 This piece is for families still in that period. Clinicians and discharge planners: it is also a useful frame for conversations about readiness.
 https://www.arcadiahomecare.ca/resources/navigating-home-care/signs-parent-needs-home-care/</w:t>
       </w:r>
@@ -1107,7 +1107,7 @@
           <w:szCs w:val="22"/>
         </w:rPr>
         <w:t xml:space="preserve">One of the most consistent patterns in home care: families know before they act.
-The gap between knowing and acting is where crisis tends to happen. Shortening that gap — not with urgency, but with validation and clarity — is one of the most useful things anyone in the care circle can offer.
+The gap between knowing and acting is where crisis tends to happen. Shortening that gap, not with urgency but with validation and clarity, is one of the most useful things anyone in the care circle can offer.
 This is the article we wrote for that moment.</w:t>
       </w:r>
     </w:p>
@@ -1296,7 +1296,7 @@
           <w:sz w:val="22"/>
           <w:szCs w:val="22"/>
         </w:rPr>
-        <w:t xml:space="preserve">Secondary: Time on page from social traffic — target 2+ minutes.</w:t>
+        <w:t xml:space="preserve">Secondary: Time on page from social traffic, target 2+ minutes.</w:t>
       </w:r>
     </w:p>
     <w:p>
@@ -1374,7 +1374,7 @@
           <w:sz w:val="22"/>
           <w:szCs w:val="22"/>
         </w:rPr>
-        <w:t xml:space="preserve">Calm. Direct. Honest. Warm — but not falsely so.</w:t>
+        <w:t xml:space="preserve">Calm. Direct. Honest. Warm, but not falsely so.</w:t>
       </w:r>
     </w:p>
     <w:p/>
@@ -1460,7 +1460,7 @@
           <w:sz w:val="22"/>
           <w:szCs w:val="22"/>
         </w:rPr>
-        <w:t xml:space="preserve">Every caption should sound like a thoughtful person speaking quietly — not a brand announcing itself.</w:t>
+        <w:t xml:space="preserve">Every caption should sound like a thoughtful person speaking quietly, not a brand announcing itself.</w:t>
       </w:r>
     </w:p>
     <w:p>

</xml_diff>